<commit_message>
feat: CPURC Word export competency grids + SIP improvements
CPURC (v1.4.1):
- Word export: 95 competency grid merge fields (P/S/M/T/R/VO x scale)
- Word export: 10 narrative merge fields restored (OSS_*, SITUAZIONE_INIZIALE, etc.)
- Template updated to official PML_V2026.docx with 137 total merge fields
- Report form: SIP consent checkbox + allegati field
- DB upgrade: sip_consent + allegati columns in reports table

SIP:
- ajax_save_phase/plan: improved validation and error handling
- sip_student: refactored UI layout
- sip_stats: fixes
- sip_export_report: improvements
- Lang strings: additions EN/IT

Coach Dashboard:
- Minor UI adjustments

Docs: Updated CLAUDE.md and DETAILS_CPURC.md with Word export mapping details

Co-Authored-By: Claude Opus 4.6 (1M context) <noreply@anthropic.com>
</commit_message>
<xml_diff>
--- a/local/ftm_cpurc/templates/rapporto_finale_template.docx
+++ b/local/ftm_cpurc/templates/rapporto_finale_template.docx
@@ -982,17 +982,6 @@
               <w:spacing w:line="240" w:lineRule="atLeast"/>
               <w:ind w:left="284"/>
               <w:rPr>
-                <w:b/>
-                <w:szCs w:val="18"/>
-                <w:lang w:val="it-CH"/>
-              </w:rPr>
-            </w:pPr>
-          </w:p>
-          <w:p>
-            <w:pPr>
-              <w:spacing w:line="240" w:lineRule="atLeast"/>
-              <w:ind w:left="284"/>
-              <w:rPr>
                 <w:szCs w:val="18"/>
                 <w:lang w:val="it-CH"/>
               </w:rPr>
@@ -1071,17 +1060,6 @@
               <w:bottom w:val="single" w:sz="6" w:space="0" w:color="808080"/>
             </w:tcBorders>
           </w:tcPr>
-          <w:p>
-            <w:pPr>
-              <w:spacing w:line="240" w:lineRule="atLeast"/>
-              <w:ind w:left="284"/>
-              <w:rPr>
-                <w:b/>
-                <w:szCs w:val="18"/>
-                <w:lang w:val="it-CH"/>
-              </w:rPr>
-            </w:pPr>
-          </w:p>
           <w:p>
             <w:pPr>
               <w:spacing w:line="240" w:lineRule="atLeast"/>
@@ -1211,16 +1189,6 @@
               <w:bottom w:val="single" w:sz="6" w:space="0" w:color="808080"/>
             </w:tcBorders>
           </w:tcPr>
-          <w:p>
-            <w:pPr>
-              <w:spacing w:line="240" w:lineRule="atLeast"/>
-              <w:rPr>
-                <w:b/>
-                <w:szCs w:val="18"/>
-                <w:lang w:val="it-CH"/>
-              </w:rPr>
-            </w:pPr>
-          </w:p>
           <w:p>
             <w:pPr>
               <w:spacing w:line="240" w:lineRule="atLeast"/>
@@ -2757,6 +2725,184 @@
           <w:insideH w:val="single" w:sz="4" w:space="0" w:color="auto"/>
           <w:insideV w:val="single" w:sz="4" w:space="0" w:color="auto"/>
         </w:tblBorders>
+        <w:tblLayout w:type="fixed"/>
+        <w:tblLook w:val="01E0" w:firstRow="1" w:lastRow="1" w:firstColumn="1" w:lastColumn="1" w:noHBand="0" w:noVBand="0"/>
+      </w:tblPr>
+      <w:tblGrid>
+        <w:gridCol w:w="7774"/>
+        <w:gridCol w:w="1251"/>
+        <w:gridCol w:w="1247"/>
+      </w:tblGrid>
+      <w:tr>
+        <w:trPr>
+          <w:trHeight w:val="567"/>
+        </w:trPr>
+        <w:tc>
+          <w:tcPr>
+            <w:tcW w:w="3784" w:type="pct"/>
+            <w:vAlign w:val="center"/>
+          </w:tcPr>
+          <w:p>
+            <w:pPr>
+              <w:jc w:val="both"/>
+            </w:pPr>
+            <w:r>
+              <w:t xml:space="preserve">La PCI </w:t>
+            </w:r>
+            <w:r>
+              <w:t xml:space="preserve">conferma la volontà di avvalersi del servizio personalizzato di coaching per le successive 10 settimane </w:t>
+            </w:r>
+            <w:r>
+              <w:rPr>
+                <w:sz w:val="16"/>
+                <w:szCs w:val="16"/>
+              </w:rPr>
+              <w:t>(</w:t>
+            </w:r>
+            <w:r>
+              <w:rPr>
+                <w:sz w:val="16"/>
+                <w:szCs w:val="16"/>
+              </w:rPr>
+              <w:t xml:space="preserve">se sì, </w:t>
+            </w:r>
+            <w:r>
+              <w:rPr>
+                <w:sz w:val="16"/>
+                <w:szCs w:val="16"/>
+              </w:rPr>
+              <w:t xml:space="preserve">apponendo la propria firma </w:t>
+            </w:r>
+            <w:r>
+              <w:rPr>
+                <w:sz w:val="16"/>
+                <w:szCs w:val="16"/>
+              </w:rPr>
+              <w:t xml:space="preserve">si </w:t>
+            </w:r>
+            <w:r>
+              <w:rPr>
+                <w:sz w:val="16"/>
+                <w:szCs w:val="16"/>
+              </w:rPr>
+              <w:t xml:space="preserve">dichiara d’accordo sulla gestione dei propri dati </w:t>
+            </w:r>
+            <w:r>
+              <w:rPr>
+                <w:sz w:val="16"/>
+                <w:szCs w:val="16"/>
+              </w:rPr>
+              <w:t xml:space="preserve">personali </w:t>
+            </w:r>
+            <w:r>
+              <w:rPr>
+                <w:sz w:val="16"/>
+                <w:szCs w:val="16"/>
+              </w:rPr>
+              <w:t xml:space="preserve">per un periodo massimo di 10 settimane dopo </w:t>
+            </w:r>
+            <w:r>
+              <w:rPr>
+                <w:sz w:val="16"/>
+                <w:szCs w:val="16"/>
+              </w:rPr>
+              <w:t>la data di fine</w:t>
+            </w:r>
+            <w:r>
+              <w:rPr>
+                <w:sz w:val="16"/>
+                <w:szCs w:val="16"/>
+              </w:rPr>
+              <w:t xml:space="preserve"> misura)</w:t>
+            </w:r>
+          </w:p>
+        </w:tc>
+        <w:tc>
+          <w:tcPr>
+            <w:tcW w:w="609" w:type="pct"/>
+            <w:vAlign w:val="center"/>
+          </w:tcPr>
+          <w:p>
+            <w:pPr>
+              <w:jc w:val="center"/>
+            </w:pPr>
+            <w:r>
+              <w:rPr>
+                <w:b/>
+              </w:rPr>
+              <w:t>Sì</w:t>
+            </w:r>
+          </w:p>
+          <w:p>
+            <w:pPr>
+              <w:jc w:val="center"/>
+            </w:pPr>
+            <w:r>
+              <w:rPr>
+                <w:rStyle w:val="unicode"/>
+                <w:rFonts w:ascii="MS Mincho" w:eastAsia="MS Mincho" w:hAnsi="MS Mincho" w:cs="MS Mincho" w:hint="eastAsia"/>
+                <w:sz w:val="22"/>
+                <w:szCs w:val="27"/>
+              </w:rPr>
+              <w:t>☐</w:t>
+            </w:r>
+          </w:p>
+        </w:tc>
+        <w:tc>
+          <w:tcPr>
+            <w:tcW w:w="607" w:type="pct"/>
+            <w:vAlign w:val="center"/>
+          </w:tcPr>
+          <w:p>
+            <w:pPr>
+              <w:jc w:val="center"/>
+            </w:pPr>
+            <w:r>
+              <w:rPr>
+                <w:b/>
+              </w:rPr>
+              <w:t>No</w:t>
+            </w:r>
+          </w:p>
+          <w:p>
+            <w:pPr>
+              <w:jc w:val="center"/>
+            </w:pPr>
+            <w:r>
+              <w:rPr>
+                <w:rStyle w:val="unicode"/>
+                <w:rFonts w:ascii="MS Mincho" w:eastAsia="MS Mincho" w:hAnsi="MS Mincho" w:cs="MS Mincho" w:hint="eastAsia"/>
+                <w:sz w:val="22"/>
+                <w:szCs w:val="27"/>
+              </w:rPr>
+              <w:t>☐</w:t>
+            </w:r>
+          </w:p>
+        </w:tc>
+      </w:tr>
+    </w:tbl>
+    <w:p>
+      <w:pPr>
+        <w:ind w:left="284"/>
+      </w:pPr>
+    </w:p>
+    <w:p>
+      <w:pPr>
+        <w:ind w:left="284"/>
+      </w:pPr>
+    </w:p>
+    <w:tbl>
+      <w:tblPr>
+        <w:tblW w:w="4772" w:type="pct"/>
+        <w:tblInd w:w="392" w:type="dxa"/>
+        <w:tblBorders>
+          <w:top w:val="single" w:sz="4" w:space="0" w:color="auto"/>
+          <w:left w:val="single" w:sz="4" w:space="0" w:color="auto"/>
+          <w:bottom w:val="single" w:sz="4" w:space="0" w:color="auto"/>
+          <w:right w:val="single" w:sz="4" w:space="0" w:color="auto"/>
+          <w:insideH w:val="single" w:sz="4" w:space="0" w:color="auto"/>
+          <w:insideV w:val="single" w:sz="4" w:space="0" w:color="auto"/>
+        </w:tblBorders>
         <w:shd w:val="clear" w:color="auto" w:fill="595959"/>
         <w:tblLayout w:type="fixed"/>
         <w:tblLook w:val="01E0" w:firstRow="1" w:lastRow="1" w:firstColumn="1" w:lastColumn="1" w:noHBand="0" w:noVBand="0"/>
@@ -2865,13 +3011,8 @@
               <w:t>«SITUAZIONE_INIZIALE»</w:t>
             </w:r>
           </w:p>
-          <w:p>
-            <w:pPr>
-              <w:rPr>
-                <w:lang w:val="it-CH"/>
-              </w:rPr>
-            </w:pPr>
-          </w:p>
+          <w:p/>
+          <w:p/>
           <w:p>
             <w:pPr>
               <w:rPr>
@@ -3327,22 +3468,22 @@
           <w:p>
             <w:pPr>
               <w:rPr>
+                <w:lang w:val="it-CH"/>
+              </w:rPr>
+            </w:pPr>
+            <w:r>
+              <w:rPr>
+                <w:lang w:val="it-CH"/>
+              </w:rPr>
+              <w:t>«VALUTAZIONE_SETTORE»</w:t>
+            </w:r>
+          </w:p>
+          <w:p>
+            <w:pPr>
+              <w:rPr>
                 <w:szCs w:val="16"/>
               </w:rPr>
             </w:pPr>
-          </w:p>
-          <w:p>
-            <w:pPr>
-              <w:rPr>
-                <w:szCs w:val="16"/>
-              </w:rPr>
-            </w:pPr>
-            <w:r>
-              <w:rPr>
-                <w:szCs w:val="16"/>
-              </w:rPr>
-              <w:t>«VALUTAZIONE_SETTORE»</w:t>
-            </w:r>
           </w:p>
           <w:p>
             <w:pPr>
@@ -3421,13 +3562,6 @@
           <w:p>
             <w:pPr>
               <w:rPr>
-                <w:szCs w:val="16"/>
-              </w:rPr>
-            </w:pPr>
-          </w:p>
-          <w:p>
-            <w:pPr>
-              <w:rPr>
                 <w:lang w:val="it-CH"/>
               </w:rPr>
             </w:pPr>
@@ -3437,6 +3571,13 @@
               </w:rPr>
               <w:t>«POSSIBILI_SETTORI»</w:t>
             </w:r>
+          </w:p>
+          <w:p>
+            <w:pPr>
+              <w:rPr>
+                <w:b/>
+              </w:rPr>
+            </w:pPr>
           </w:p>
           <w:p>
             <w:pPr>
@@ -3523,22 +3664,22 @@
           <w:p>
             <w:pPr>
               <w:rPr>
+                <w:lang w:val="it-CH"/>
+              </w:rPr>
+            </w:pPr>
+            <w:r>
+              <w:rPr>
+                <w:lang w:val="it-CH"/>
+              </w:rPr>
+              <w:t>«SINTESI_CONCLUSIVA»</w:t>
+            </w:r>
+          </w:p>
+          <w:p>
+            <w:pPr>
+              <w:rPr>
                 <w:szCs w:val="16"/>
               </w:rPr>
             </w:pPr>
-          </w:p>
-          <w:p>
-            <w:pPr>
-              <w:rPr>
-                <w:lang w:val="it-CH"/>
-              </w:rPr>
-            </w:pPr>
-            <w:r>
-              <w:rPr>
-                <w:lang w:val="it-CH"/>
-              </w:rPr>
-              <w:t>«SINTESI_CONCLUSIVA»</w:t>
-            </w:r>
           </w:p>
           <w:p>
             <w:pPr>
@@ -3864,7 +4005,6 @@
           <w:tcPr>
             <w:tcW w:w="622" w:type="pct"/>
             <w:gridSpan w:val="2"/>
-            <w:vAlign w:val="center"/>
           </w:tcPr>
           <w:p>
             <w:pPr>
@@ -3874,7 +4014,11 @@
               </w:rPr>
             </w:pPr>
             <w:r>
-              <w:t>x</w:t>
+              <w:rPr>
+                <w:rFonts w:ascii="Calibri" w:hAnsi="Calibri"/>
+                <w:color w:val="000000"/>
+              </w:rPr>
+              <w:t>«P0_MB»</w:t>
             </w:r>
           </w:p>
         </w:tc>
@@ -3882,7 +4026,6 @@
           <w:tcPr>
             <w:tcW w:w="468" w:type="pct"/>
             <w:gridSpan w:val="2"/>
-            <w:vAlign w:val="center"/>
           </w:tcPr>
           <w:p>
             <w:pPr>
@@ -3891,12 +4034,18 @@
                 <w:sz w:val="22"/>
               </w:rPr>
             </w:pPr>
+            <w:r>
+              <w:rPr>
+                <w:rFonts w:ascii="Calibri" w:hAnsi="Calibri"/>
+                <w:color w:val="000000"/>
+              </w:rPr>
+              <w:t>«P0_B»</w:t>
+            </w:r>
           </w:p>
         </w:tc>
         <w:tc>
           <w:tcPr>
             <w:tcW w:w="533" w:type="pct"/>
-            <w:vAlign w:val="center"/>
           </w:tcPr>
           <w:p>
             <w:pPr>
@@ -3905,12 +4054,18 @@
                 <w:sz w:val="22"/>
               </w:rPr>
             </w:pPr>
+            <w:r>
+              <w:rPr>
+                <w:rFonts w:ascii="Calibri" w:hAnsi="Calibri"/>
+                <w:color w:val="000000"/>
+              </w:rPr>
+              <w:t>«P0_S»</w:t>
+            </w:r>
           </w:p>
         </w:tc>
         <w:tc>
           <w:tcPr>
             <w:tcW w:w="519" w:type="pct"/>
-            <w:vAlign w:val="center"/>
           </w:tcPr>
           <w:p>
             <w:pPr>
@@ -3919,13 +4074,19 @@
                 <w:sz w:val="22"/>
               </w:rPr>
             </w:pPr>
+            <w:r>
+              <w:rPr>
+                <w:rFonts w:ascii="Calibri" w:hAnsi="Calibri"/>
+                <w:color w:val="000000"/>
+              </w:rPr>
+              <w:t>«P0_I»</w:t>
+            </w:r>
           </w:p>
         </w:tc>
         <w:tc>
           <w:tcPr>
             <w:tcW w:w="429" w:type="pct"/>
             <w:gridSpan w:val="2"/>
-            <w:vAlign w:val="center"/>
           </w:tcPr>
           <w:p>
             <w:pPr>
@@ -3934,6 +4095,13 @@
                 <w:sz w:val="22"/>
               </w:rPr>
             </w:pPr>
+            <w:r>
+              <w:rPr>
+                <w:rFonts w:ascii="Calibri" w:hAnsi="Calibri"/>
+                <w:color w:val="000000"/>
+              </w:rPr>
+              <w:t>«P0_NV»</w:t>
+            </w:r>
           </w:p>
         </w:tc>
       </w:tr>
@@ -3967,7 +4135,6 @@
           <w:tcPr>
             <w:tcW w:w="622" w:type="pct"/>
             <w:gridSpan w:val="2"/>
-            <w:vAlign w:val="center"/>
           </w:tcPr>
           <w:p>
             <w:pPr>
@@ -3977,7 +4144,11 @@
               </w:rPr>
             </w:pPr>
             <w:r>
-              <w:t>x</w:t>
+              <w:rPr>
+                <w:rFonts w:ascii="Calibri" w:hAnsi="Calibri"/>
+                <w:color w:val="000000"/>
+              </w:rPr>
+              <w:t>«P1_MB»</w:t>
             </w:r>
           </w:p>
         </w:tc>
@@ -3985,7 +4156,6 @@
           <w:tcPr>
             <w:tcW w:w="468" w:type="pct"/>
             <w:gridSpan w:val="2"/>
-            <w:vAlign w:val="center"/>
           </w:tcPr>
           <w:p>
             <w:pPr>
@@ -3994,12 +4164,18 @@
                 <w:sz w:val="22"/>
               </w:rPr>
             </w:pPr>
+            <w:r>
+              <w:rPr>
+                <w:rFonts w:ascii="Calibri" w:hAnsi="Calibri"/>
+                <w:color w:val="000000"/>
+              </w:rPr>
+              <w:t>«P1_B»</w:t>
+            </w:r>
           </w:p>
         </w:tc>
         <w:tc>
           <w:tcPr>
             <w:tcW w:w="533" w:type="pct"/>
-            <w:vAlign w:val="center"/>
           </w:tcPr>
           <w:p>
             <w:pPr>
@@ -4008,12 +4184,18 @@
                 <w:sz w:val="22"/>
               </w:rPr>
             </w:pPr>
+            <w:r>
+              <w:rPr>
+                <w:rFonts w:ascii="Calibri" w:hAnsi="Calibri"/>
+                <w:color w:val="000000"/>
+              </w:rPr>
+              <w:t>«P1_S»</w:t>
+            </w:r>
           </w:p>
         </w:tc>
         <w:tc>
           <w:tcPr>
             <w:tcW w:w="519" w:type="pct"/>
-            <w:vAlign w:val="center"/>
           </w:tcPr>
           <w:p>
             <w:pPr>
@@ -4022,13 +4204,19 @@
                 <w:sz w:val="22"/>
               </w:rPr>
             </w:pPr>
+            <w:r>
+              <w:rPr>
+                <w:rFonts w:ascii="Calibri" w:hAnsi="Calibri"/>
+                <w:color w:val="000000"/>
+              </w:rPr>
+              <w:t>«P1_I»</w:t>
+            </w:r>
           </w:p>
         </w:tc>
         <w:tc>
           <w:tcPr>
             <w:tcW w:w="429" w:type="pct"/>
             <w:gridSpan w:val="2"/>
-            <w:vAlign w:val="center"/>
           </w:tcPr>
           <w:p>
             <w:pPr>
@@ -4037,6 +4225,13 @@
                 <w:sz w:val="22"/>
               </w:rPr>
             </w:pPr>
+            <w:r>
+              <w:rPr>
+                <w:rFonts w:ascii="Calibri" w:hAnsi="Calibri"/>
+                <w:color w:val="000000"/>
+              </w:rPr>
+              <w:t>«P1_NV»</w:t>
+            </w:r>
           </w:p>
         </w:tc>
       </w:tr>
@@ -4070,7 +4265,6 @@
           <w:tcPr>
             <w:tcW w:w="622" w:type="pct"/>
             <w:gridSpan w:val="2"/>
-            <w:vAlign w:val="center"/>
           </w:tcPr>
           <w:p>
             <w:pPr>
@@ -4080,7 +4274,11 @@
               </w:rPr>
             </w:pPr>
             <w:r>
-              <w:t>x</w:t>
+              <w:rPr>
+                <w:rFonts w:ascii="Calibri" w:hAnsi="Calibri"/>
+                <w:color w:val="000000"/>
+              </w:rPr>
+              <w:t>«P2_MB»</w:t>
             </w:r>
           </w:p>
         </w:tc>
@@ -4088,7 +4286,6 @@
           <w:tcPr>
             <w:tcW w:w="468" w:type="pct"/>
             <w:gridSpan w:val="2"/>
-            <w:vAlign w:val="center"/>
           </w:tcPr>
           <w:p>
             <w:pPr>
@@ -4097,12 +4294,18 @@
                 <w:sz w:val="22"/>
               </w:rPr>
             </w:pPr>
+            <w:r>
+              <w:rPr>
+                <w:rFonts w:ascii="Calibri" w:hAnsi="Calibri"/>
+                <w:color w:val="000000"/>
+              </w:rPr>
+              <w:t>«P2_B»</w:t>
+            </w:r>
           </w:p>
         </w:tc>
         <w:tc>
           <w:tcPr>
             <w:tcW w:w="533" w:type="pct"/>
-            <w:vAlign w:val="center"/>
           </w:tcPr>
           <w:p>
             <w:pPr>
@@ -4111,12 +4314,18 @@
                 <w:sz w:val="22"/>
               </w:rPr>
             </w:pPr>
+            <w:r>
+              <w:rPr>
+                <w:rFonts w:ascii="Calibri" w:hAnsi="Calibri"/>
+                <w:color w:val="000000"/>
+              </w:rPr>
+              <w:t>«P2_S»</w:t>
+            </w:r>
           </w:p>
         </w:tc>
         <w:tc>
           <w:tcPr>
             <w:tcW w:w="519" w:type="pct"/>
-            <w:vAlign w:val="center"/>
           </w:tcPr>
           <w:p>
             <w:pPr>
@@ -4125,13 +4334,19 @@
                 <w:sz w:val="22"/>
               </w:rPr>
             </w:pPr>
+            <w:r>
+              <w:rPr>
+                <w:rFonts w:ascii="Calibri" w:hAnsi="Calibri"/>
+                <w:color w:val="000000"/>
+              </w:rPr>
+              <w:t>«P2_I»</w:t>
+            </w:r>
           </w:p>
         </w:tc>
         <w:tc>
           <w:tcPr>
             <w:tcW w:w="429" w:type="pct"/>
             <w:gridSpan w:val="2"/>
-            <w:vAlign w:val="center"/>
           </w:tcPr>
           <w:p>
             <w:pPr>
@@ -4140,6 +4355,13 @@
                 <w:sz w:val="22"/>
               </w:rPr>
             </w:pPr>
+            <w:r>
+              <w:rPr>
+                <w:rFonts w:ascii="Calibri" w:hAnsi="Calibri"/>
+                <w:color w:val="000000"/>
+              </w:rPr>
+              <w:t>«P2_NV»</w:t>
+            </w:r>
           </w:p>
         </w:tc>
       </w:tr>
@@ -4173,7 +4395,6 @@
           <w:tcPr>
             <w:tcW w:w="622" w:type="pct"/>
             <w:gridSpan w:val="2"/>
-            <w:vAlign w:val="center"/>
           </w:tcPr>
           <w:p>
             <w:pPr>
@@ -4183,7 +4404,11 @@
               </w:rPr>
             </w:pPr>
             <w:r>
-              <w:t>x</w:t>
+              <w:rPr>
+                <w:rFonts w:ascii="Calibri" w:hAnsi="Calibri"/>
+                <w:color w:val="000000"/>
+              </w:rPr>
+              <w:t>«P3_MB»</w:t>
             </w:r>
           </w:p>
         </w:tc>
@@ -4191,7 +4416,6 @@
           <w:tcPr>
             <w:tcW w:w="468" w:type="pct"/>
             <w:gridSpan w:val="2"/>
-            <w:vAlign w:val="center"/>
           </w:tcPr>
           <w:p>
             <w:pPr>
@@ -4200,12 +4424,18 @@
                 <w:sz w:val="22"/>
               </w:rPr>
             </w:pPr>
+            <w:r>
+              <w:rPr>
+                <w:rFonts w:ascii="Calibri" w:hAnsi="Calibri"/>
+                <w:color w:val="000000"/>
+              </w:rPr>
+              <w:t>«P3_B»</w:t>
+            </w:r>
           </w:p>
         </w:tc>
         <w:tc>
           <w:tcPr>
             <w:tcW w:w="533" w:type="pct"/>
-            <w:vAlign w:val="center"/>
           </w:tcPr>
           <w:p>
             <w:pPr>
@@ -4214,12 +4444,18 @@
                 <w:sz w:val="22"/>
               </w:rPr>
             </w:pPr>
+            <w:r>
+              <w:rPr>
+                <w:rFonts w:ascii="Calibri" w:hAnsi="Calibri"/>
+                <w:color w:val="000000"/>
+              </w:rPr>
+              <w:t>«P3_S»</w:t>
+            </w:r>
           </w:p>
         </w:tc>
         <w:tc>
           <w:tcPr>
             <w:tcW w:w="519" w:type="pct"/>
-            <w:vAlign w:val="center"/>
           </w:tcPr>
           <w:p>
             <w:pPr>
@@ -4228,13 +4464,19 @@
                 <w:sz w:val="22"/>
               </w:rPr>
             </w:pPr>
+            <w:r>
+              <w:rPr>
+                <w:rFonts w:ascii="Calibri" w:hAnsi="Calibri"/>
+                <w:color w:val="000000"/>
+              </w:rPr>
+              <w:t>«P3_I»</w:t>
+            </w:r>
           </w:p>
         </w:tc>
         <w:tc>
           <w:tcPr>
             <w:tcW w:w="429" w:type="pct"/>
             <w:gridSpan w:val="2"/>
-            <w:vAlign w:val="center"/>
           </w:tcPr>
           <w:p>
             <w:pPr>
@@ -4243,6 +4485,13 @@
                 <w:sz w:val="22"/>
               </w:rPr>
             </w:pPr>
+            <w:r>
+              <w:rPr>
+                <w:rFonts w:ascii="Calibri" w:hAnsi="Calibri"/>
+                <w:color w:val="000000"/>
+              </w:rPr>
+              <w:t>«P3_NV»</w:t>
+            </w:r>
           </w:p>
         </w:tc>
       </w:tr>
@@ -4276,7 +4525,6 @@
           <w:tcPr>
             <w:tcW w:w="622" w:type="pct"/>
             <w:gridSpan w:val="2"/>
-            <w:vAlign w:val="center"/>
           </w:tcPr>
           <w:p>
             <w:pPr>
@@ -4286,7 +4534,11 @@
               </w:rPr>
             </w:pPr>
             <w:r>
-              <w:t>x</w:t>
+              <w:rPr>
+                <w:rFonts w:ascii="Calibri" w:hAnsi="Calibri"/>
+                <w:color w:val="000000"/>
+              </w:rPr>
+              <w:t>«P4_MB»</w:t>
             </w:r>
           </w:p>
         </w:tc>
@@ -4294,7 +4546,6 @@
           <w:tcPr>
             <w:tcW w:w="468" w:type="pct"/>
             <w:gridSpan w:val="2"/>
-            <w:vAlign w:val="center"/>
           </w:tcPr>
           <w:p>
             <w:pPr>
@@ -4303,12 +4554,18 @@
                 <w:sz w:val="22"/>
               </w:rPr>
             </w:pPr>
+            <w:r>
+              <w:rPr>
+                <w:rFonts w:ascii="Calibri" w:hAnsi="Calibri"/>
+                <w:color w:val="000000"/>
+              </w:rPr>
+              <w:t>«P4_B»</w:t>
+            </w:r>
           </w:p>
         </w:tc>
         <w:tc>
           <w:tcPr>
             <w:tcW w:w="533" w:type="pct"/>
-            <w:vAlign w:val="center"/>
           </w:tcPr>
           <w:p>
             <w:pPr>
@@ -4317,12 +4574,18 @@
                 <w:sz w:val="22"/>
               </w:rPr>
             </w:pPr>
+            <w:r>
+              <w:rPr>
+                <w:rFonts w:ascii="Calibri" w:hAnsi="Calibri"/>
+                <w:color w:val="000000"/>
+              </w:rPr>
+              <w:t>«P4_S»</w:t>
+            </w:r>
           </w:p>
         </w:tc>
         <w:tc>
           <w:tcPr>
             <w:tcW w:w="519" w:type="pct"/>
-            <w:vAlign w:val="center"/>
           </w:tcPr>
           <w:p>
             <w:pPr>
@@ -4331,13 +4594,19 @@
                 <w:sz w:val="22"/>
               </w:rPr>
             </w:pPr>
+            <w:r>
+              <w:rPr>
+                <w:rFonts w:ascii="Calibri" w:hAnsi="Calibri"/>
+                <w:color w:val="000000"/>
+              </w:rPr>
+              <w:t>«P4_I»</w:t>
+            </w:r>
           </w:p>
         </w:tc>
         <w:tc>
           <w:tcPr>
             <w:tcW w:w="429" w:type="pct"/>
             <w:gridSpan w:val="2"/>
-            <w:vAlign w:val="center"/>
           </w:tcPr>
           <w:p>
             <w:pPr>
@@ -4346,6 +4615,13 @@
                 <w:sz w:val="22"/>
               </w:rPr>
             </w:pPr>
+            <w:r>
+              <w:rPr>
+                <w:rFonts w:ascii="Calibri" w:hAnsi="Calibri"/>
+                <w:color w:val="000000"/>
+              </w:rPr>
+              <w:t>«P4_NV»</w:t>
+            </w:r>
           </w:p>
         </w:tc>
       </w:tr>
@@ -4408,6 +4684,13 @@
               </w:rPr>
             </w:pPr>
           </w:p>
+          <w:p>
+            <w:pPr>
+              <w:rPr>
+                <w:rFonts w:cs="Arial"/>
+              </w:rPr>
+            </w:pPr>
+          </w:p>
         </w:tc>
       </w:tr>
       <w:tr>
@@ -4586,14 +4869,17 @@
           <w:tcPr>
             <w:tcW w:w="622" w:type="pct"/>
             <w:gridSpan w:val="2"/>
-            <w:vAlign w:val="center"/>
-          </w:tcPr>
-          <w:p>
-            <w:pPr>
-              <w:jc w:val="center"/>
-            </w:pPr>
-            <w:r>
-              <w:t>x</w:t>
+          </w:tcPr>
+          <w:p>
+            <w:pPr>
+              <w:jc w:val="center"/>
+            </w:pPr>
+            <w:r>
+              <w:rPr>
+                <w:rFonts w:ascii="Calibri" w:hAnsi="Calibri"/>
+                <w:color w:val="000000"/>
+              </w:rPr>
+              <w:t>«S0_MB»</w:t>
             </w:r>
           </w:p>
         </w:tc>
@@ -4601,46 +4887,70 @@
           <w:tcPr>
             <w:tcW w:w="468" w:type="pct"/>
             <w:gridSpan w:val="2"/>
-            <w:vAlign w:val="center"/>
-          </w:tcPr>
-          <w:p>
-            <w:pPr>
-              <w:jc w:val="center"/>
-            </w:pPr>
+          </w:tcPr>
+          <w:p>
+            <w:pPr>
+              <w:jc w:val="center"/>
+            </w:pPr>
+            <w:r>
+              <w:rPr>
+                <w:rFonts w:ascii="Calibri" w:hAnsi="Calibri"/>
+                <w:color w:val="000000"/>
+              </w:rPr>
+              <w:t>«S0_B»</w:t>
+            </w:r>
           </w:p>
         </w:tc>
         <w:tc>
           <w:tcPr>
             <w:tcW w:w="533" w:type="pct"/>
-            <w:vAlign w:val="center"/>
-          </w:tcPr>
-          <w:p>
-            <w:pPr>
-              <w:jc w:val="center"/>
-            </w:pPr>
+          </w:tcPr>
+          <w:p>
+            <w:pPr>
+              <w:jc w:val="center"/>
+            </w:pPr>
+            <w:r>
+              <w:rPr>
+                <w:rFonts w:ascii="Calibri" w:hAnsi="Calibri"/>
+                <w:color w:val="000000"/>
+              </w:rPr>
+              <w:t>«S0_S»</w:t>
+            </w:r>
           </w:p>
         </w:tc>
         <w:tc>
           <w:tcPr>
             <w:tcW w:w="572" w:type="pct"/>
             <w:gridSpan w:val="2"/>
-            <w:vAlign w:val="center"/>
-          </w:tcPr>
-          <w:p>
-            <w:pPr>
-              <w:jc w:val="center"/>
-            </w:pPr>
+          </w:tcPr>
+          <w:p>
+            <w:pPr>
+              <w:jc w:val="center"/>
+            </w:pPr>
+            <w:r>
+              <w:rPr>
+                <w:rFonts w:ascii="Calibri" w:hAnsi="Calibri"/>
+                <w:color w:val="000000"/>
+              </w:rPr>
+              <w:t>«S0_I»</w:t>
+            </w:r>
           </w:p>
         </w:tc>
         <w:tc>
           <w:tcPr>
             <w:tcW w:w="376" w:type="pct"/>
-            <w:vAlign w:val="center"/>
-          </w:tcPr>
-          <w:p>
-            <w:pPr>
-              <w:jc w:val="center"/>
-            </w:pPr>
+          </w:tcPr>
+          <w:p>
+            <w:pPr>
+              <w:jc w:val="center"/>
+            </w:pPr>
+            <w:r>
+              <w:rPr>
+                <w:rFonts w:ascii="Calibri" w:hAnsi="Calibri"/>
+                <w:color w:val="000000"/>
+              </w:rPr>
+              <w:t>«S0_NV»</w:t>
+            </w:r>
           </w:p>
         </w:tc>
       </w:tr>
@@ -4666,14 +4976,17 @@
           <w:tcPr>
             <w:tcW w:w="622" w:type="pct"/>
             <w:gridSpan w:val="2"/>
-            <w:vAlign w:val="center"/>
-          </w:tcPr>
-          <w:p>
-            <w:pPr>
-              <w:jc w:val="center"/>
-            </w:pPr>
-            <w:r>
-              <w:t>x</w:t>
+          </w:tcPr>
+          <w:p>
+            <w:pPr>
+              <w:jc w:val="center"/>
+            </w:pPr>
+            <w:r>
+              <w:rPr>
+                <w:rFonts w:ascii="Calibri" w:hAnsi="Calibri"/>
+                <w:color w:val="000000"/>
+              </w:rPr>
+              <w:t>«S1_MB»</w:t>
             </w:r>
           </w:p>
         </w:tc>
@@ -4681,46 +4994,70 @@
           <w:tcPr>
             <w:tcW w:w="468" w:type="pct"/>
             <w:gridSpan w:val="2"/>
-            <w:vAlign w:val="center"/>
-          </w:tcPr>
-          <w:p>
-            <w:pPr>
-              <w:jc w:val="center"/>
-            </w:pPr>
+          </w:tcPr>
+          <w:p>
+            <w:pPr>
+              <w:jc w:val="center"/>
+            </w:pPr>
+            <w:r>
+              <w:rPr>
+                <w:rFonts w:ascii="Calibri" w:hAnsi="Calibri"/>
+                <w:color w:val="000000"/>
+              </w:rPr>
+              <w:t>«S1_B»</w:t>
+            </w:r>
           </w:p>
         </w:tc>
         <w:tc>
           <w:tcPr>
             <w:tcW w:w="533" w:type="pct"/>
-            <w:vAlign w:val="center"/>
-          </w:tcPr>
-          <w:p>
-            <w:pPr>
-              <w:jc w:val="center"/>
-            </w:pPr>
+          </w:tcPr>
+          <w:p>
+            <w:pPr>
+              <w:jc w:val="center"/>
+            </w:pPr>
+            <w:r>
+              <w:rPr>
+                <w:rFonts w:ascii="Calibri" w:hAnsi="Calibri"/>
+                <w:color w:val="000000"/>
+              </w:rPr>
+              <w:t>«S1_S»</w:t>
+            </w:r>
           </w:p>
         </w:tc>
         <w:tc>
           <w:tcPr>
             <w:tcW w:w="572" w:type="pct"/>
             <w:gridSpan w:val="2"/>
-            <w:vAlign w:val="center"/>
-          </w:tcPr>
-          <w:p>
-            <w:pPr>
-              <w:jc w:val="center"/>
-            </w:pPr>
+          </w:tcPr>
+          <w:p>
+            <w:pPr>
+              <w:jc w:val="center"/>
+            </w:pPr>
+            <w:r>
+              <w:rPr>
+                <w:rFonts w:ascii="Calibri" w:hAnsi="Calibri"/>
+                <w:color w:val="000000"/>
+              </w:rPr>
+              <w:t>«S1_I»</w:t>
+            </w:r>
           </w:p>
         </w:tc>
         <w:tc>
           <w:tcPr>
             <w:tcW w:w="376" w:type="pct"/>
-            <w:vAlign w:val="center"/>
-          </w:tcPr>
-          <w:p>
-            <w:pPr>
-              <w:jc w:val="center"/>
-            </w:pPr>
+          </w:tcPr>
+          <w:p>
+            <w:pPr>
+              <w:jc w:val="center"/>
+            </w:pPr>
+            <w:r>
+              <w:rPr>
+                <w:rFonts w:ascii="Calibri" w:hAnsi="Calibri"/>
+                <w:color w:val="000000"/>
+              </w:rPr>
+              <w:t>«S1_NV»</w:t>
+            </w:r>
           </w:p>
         </w:tc>
       </w:tr>
@@ -4754,6 +5091,7 @@
               <w:t>«OSS_SOCIALI»</w:t>
             </w:r>
           </w:p>
+          <w:p/>
           <w:p/>
           <w:p/>
           <w:p/>
@@ -4935,61 +5273,88 @@
           <w:tcPr>
             <w:tcW w:w="622" w:type="pct"/>
             <w:gridSpan w:val="2"/>
-            <w:vAlign w:val="center"/>
-          </w:tcPr>
-          <w:p>
-            <w:pPr>
-              <w:jc w:val="center"/>
-            </w:pPr>
-            <w:r>
-              <w:t>x</w:t>
+          </w:tcPr>
+          <w:p>
+            <w:pPr>
+              <w:jc w:val="center"/>
+            </w:pPr>
+            <w:r>
+              <w:rPr>
+                <w:rFonts w:ascii="Calibri" w:hAnsi="Calibri"/>
+                <w:color w:val="000000"/>
+              </w:rPr>
+              <w:t>«M0_MB»</w:t>
             </w:r>
           </w:p>
         </w:tc>
         <w:tc>
           <w:tcPr>
             <w:tcW w:w="465" w:type="pct"/>
-            <w:vAlign w:val="center"/>
-          </w:tcPr>
-          <w:p>
-            <w:pPr>
-              <w:jc w:val="center"/>
-            </w:pPr>
+          </w:tcPr>
+          <w:p>
+            <w:pPr>
+              <w:jc w:val="center"/>
+            </w:pPr>
+            <w:r>
+              <w:rPr>
+                <w:rFonts w:ascii="Calibri" w:hAnsi="Calibri"/>
+                <w:color w:val="000000"/>
+              </w:rPr>
+              <w:t>«M0_B»</w:t>
+            </w:r>
           </w:p>
         </w:tc>
         <w:tc>
           <w:tcPr>
             <w:tcW w:w="536" w:type="pct"/>
             <w:gridSpan w:val="2"/>
-            <w:vAlign w:val="center"/>
-          </w:tcPr>
-          <w:p>
-            <w:pPr>
-              <w:jc w:val="center"/>
-            </w:pPr>
+          </w:tcPr>
+          <w:p>
+            <w:pPr>
+              <w:jc w:val="center"/>
+            </w:pPr>
+            <w:r>
+              <w:rPr>
+                <w:rFonts w:ascii="Calibri" w:hAnsi="Calibri"/>
+                <w:color w:val="000000"/>
+              </w:rPr>
+              <w:t>«M0_S»</w:t>
+            </w:r>
           </w:p>
         </w:tc>
         <w:tc>
           <w:tcPr>
             <w:tcW w:w="572" w:type="pct"/>
             <w:gridSpan w:val="2"/>
-            <w:vAlign w:val="center"/>
-          </w:tcPr>
-          <w:p>
-            <w:pPr>
-              <w:jc w:val="center"/>
-            </w:pPr>
+          </w:tcPr>
+          <w:p>
+            <w:pPr>
+              <w:jc w:val="center"/>
+            </w:pPr>
+            <w:r>
+              <w:rPr>
+                <w:rFonts w:ascii="Calibri" w:hAnsi="Calibri"/>
+                <w:color w:val="000000"/>
+              </w:rPr>
+              <w:t>«M0_I»</w:t>
+            </w:r>
           </w:p>
         </w:tc>
         <w:tc>
           <w:tcPr>
             <w:tcW w:w="376" w:type="pct"/>
-            <w:vAlign w:val="center"/>
-          </w:tcPr>
-          <w:p>
-            <w:pPr>
-              <w:jc w:val="center"/>
-            </w:pPr>
+          </w:tcPr>
+          <w:p>
+            <w:pPr>
+              <w:jc w:val="center"/>
+            </w:pPr>
+            <w:r>
+              <w:rPr>
+                <w:rFonts w:ascii="Calibri" w:hAnsi="Calibri"/>
+                <w:color w:val="000000"/>
+              </w:rPr>
+              <w:t>«M0_NV»</w:t>
+            </w:r>
           </w:p>
         </w:tc>
       </w:tr>
@@ -5015,61 +5380,88 @@
           <w:tcPr>
             <w:tcW w:w="622" w:type="pct"/>
             <w:gridSpan w:val="2"/>
-            <w:vAlign w:val="center"/>
-          </w:tcPr>
-          <w:p>
-            <w:pPr>
-              <w:jc w:val="center"/>
-            </w:pPr>
-            <w:r>
-              <w:t>x</w:t>
+          </w:tcPr>
+          <w:p>
+            <w:pPr>
+              <w:jc w:val="center"/>
+            </w:pPr>
+            <w:r>
+              <w:rPr>
+                <w:rFonts w:ascii="Calibri" w:hAnsi="Calibri"/>
+                <w:color w:val="000000"/>
+              </w:rPr>
+              <w:t>«M1_MB»</w:t>
             </w:r>
           </w:p>
         </w:tc>
         <w:tc>
           <w:tcPr>
             <w:tcW w:w="465" w:type="pct"/>
-            <w:vAlign w:val="center"/>
-          </w:tcPr>
-          <w:p>
-            <w:pPr>
-              <w:jc w:val="center"/>
-            </w:pPr>
+          </w:tcPr>
+          <w:p>
+            <w:pPr>
+              <w:jc w:val="center"/>
+            </w:pPr>
+            <w:r>
+              <w:rPr>
+                <w:rFonts w:ascii="Calibri" w:hAnsi="Calibri"/>
+                <w:color w:val="000000"/>
+              </w:rPr>
+              <w:t>«M1_B»</w:t>
+            </w:r>
           </w:p>
         </w:tc>
         <w:tc>
           <w:tcPr>
             <w:tcW w:w="536" w:type="pct"/>
             <w:gridSpan w:val="2"/>
-            <w:vAlign w:val="center"/>
-          </w:tcPr>
-          <w:p>
-            <w:pPr>
-              <w:jc w:val="center"/>
-            </w:pPr>
+          </w:tcPr>
+          <w:p>
+            <w:pPr>
+              <w:jc w:val="center"/>
+            </w:pPr>
+            <w:r>
+              <w:rPr>
+                <w:rFonts w:ascii="Calibri" w:hAnsi="Calibri"/>
+                <w:color w:val="000000"/>
+              </w:rPr>
+              <w:t>«M1_S»</w:t>
+            </w:r>
           </w:p>
         </w:tc>
         <w:tc>
           <w:tcPr>
             <w:tcW w:w="572" w:type="pct"/>
             <w:gridSpan w:val="2"/>
-            <w:vAlign w:val="center"/>
-          </w:tcPr>
-          <w:p>
-            <w:pPr>
-              <w:jc w:val="center"/>
-            </w:pPr>
+          </w:tcPr>
+          <w:p>
+            <w:pPr>
+              <w:jc w:val="center"/>
+            </w:pPr>
+            <w:r>
+              <w:rPr>
+                <w:rFonts w:ascii="Calibri" w:hAnsi="Calibri"/>
+                <w:color w:val="000000"/>
+              </w:rPr>
+              <w:t>«M1_I»</w:t>
+            </w:r>
           </w:p>
         </w:tc>
         <w:tc>
           <w:tcPr>
             <w:tcW w:w="376" w:type="pct"/>
-            <w:vAlign w:val="center"/>
-          </w:tcPr>
-          <w:p>
-            <w:pPr>
-              <w:jc w:val="center"/>
-            </w:pPr>
+          </w:tcPr>
+          <w:p>
+            <w:pPr>
+              <w:jc w:val="center"/>
+            </w:pPr>
+            <w:r>
+              <w:rPr>
+                <w:rFonts w:ascii="Calibri" w:hAnsi="Calibri"/>
+                <w:color w:val="000000"/>
+              </w:rPr>
+              <w:t>«M1_NV»</w:t>
+            </w:r>
           </w:p>
         </w:tc>
       </w:tr>
@@ -5095,61 +5487,88 @@
           <w:tcPr>
             <w:tcW w:w="622" w:type="pct"/>
             <w:gridSpan w:val="2"/>
-            <w:vAlign w:val="center"/>
-          </w:tcPr>
-          <w:p>
-            <w:pPr>
-              <w:jc w:val="center"/>
-            </w:pPr>
-            <w:r>
-              <w:t>x</w:t>
+          </w:tcPr>
+          <w:p>
+            <w:pPr>
+              <w:jc w:val="center"/>
+            </w:pPr>
+            <w:r>
+              <w:rPr>
+                <w:rFonts w:ascii="Calibri" w:hAnsi="Calibri"/>
+                <w:color w:val="000000"/>
+              </w:rPr>
+              <w:t>«M2_MB»</w:t>
             </w:r>
           </w:p>
         </w:tc>
         <w:tc>
           <w:tcPr>
             <w:tcW w:w="465" w:type="pct"/>
-            <w:vAlign w:val="center"/>
-          </w:tcPr>
-          <w:p>
-            <w:pPr>
-              <w:jc w:val="center"/>
-            </w:pPr>
+          </w:tcPr>
+          <w:p>
+            <w:pPr>
+              <w:jc w:val="center"/>
+            </w:pPr>
+            <w:r>
+              <w:rPr>
+                <w:rFonts w:ascii="Calibri" w:hAnsi="Calibri"/>
+                <w:color w:val="000000"/>
+              </w:rPr>
+              <w:t>«M2_B»</w:t>
+            </w:r>
           </w:p>
         </w:tc>
         <w:tc>
           <w:tcPr>
             <w:tcW w:w="536" w:type="pct"/>
             <w:gridSpan w:val="2"/>
-            <w:vAlign w:val="center"/>
-          </w:tcPr>
-          <w:p>
-            <w:pPr>
-              <w:jc w:val="center"/>
-            </w:pPr>
+          </w:tcPr>
+          <w:p>
+            <w:pPr>
+              <w:jc w:val="center"/>
+            </w:pPr>
+            <w:r>
+              <w:rPr>
+                <w:rFonts w:ascii="Calibri" w:hAnsi="Calibri"/>
+                <w:color w:val="000000"/>
+              </w:rPr>
+              <w:t>«M2_S»</w:t>
+            </w:r>
           </w:p>
         </w:tc>
         <w:tc>
           <w:tcPr>
             <w:tcW w:w="572" w:type="pct"/>
             <w:gridSpan w:val="2"/>
-            <w:vAlign w:val="center"/>
-          </w:tcPr>
-          <w:p>
-            <w:pPr>
-              <w:jc w:val="center"/>
-            </w:pPr>
+          </w:tcPr>
+          <w:p>
+            <w:pPr>
+              <w:jc w:val="center"/>
+            </w:pPr>
+            <w:r>
+              <w:rPr>
+                <w:rFonts w:ascii="Calibri" w:hAnsi="Calibri"/>
+                <w:color w:val="000000"/>
+              </w:rPr>
+              <w:t>«M2_I»</w:t>
+            </w:r>
           </w:p>
         </w:tc>
         <w:tc>
           <w:tcPr>
             <w:tcW w:w="376" w:type="pct"/>
-            <w:vAlign w:val="center"/>
-          </w:tcPr>
-          <w:p>
-            <w:pPr>
-              <w:jc w:val="center"/>
-            </w:pPr>
+          </w:tcPr>
+          <w:p>
+            <w:pPr>
+              <w:jc w:val="center"/>
+            </w:pPr>
+            <w:r>
+              <w:rPr>
+                <w:rFonts w:ascii="Calibri" w:hAnsi="Calibri"/>
+                <w:color w:val="000000"/>
+              </w:rPr>
+              <w:t>«M2_NV»</w:t>
+            </w:r>
           </w:p>
         </w:tc>
       </w:tr>
@@ -5175,61 +5594,88 @@
           <w:tcPr>
             <w:tcW w:w="622" w:type="pct"/>
             <w:gridSpan w:val="2"/>
-            <w:vAlign w:val="center"/>
-          </w:tcPr>
-          <w:p>
-            <w:pPr>
-              <w:jc w:val="center"/>
-            </w:pPr>
-            <w:r>
-              <w:t>x</w:t>
+          </w:tcPr>
+          <w:p>
+            <w:pPr>
+              <w:jc w:val="center"/>
+            </w:pPr>
+            <w:r>
+              <w:rPr>
+                <w:rFonts w:ascii="Calibri" w:hAnsi="Calibri"/>
+                <w:color w:val="000000"/>
+              </w:rPr>
+              <w:t>«M3_MB»</w:t>
             </w:r>
           </w:p>
         </w:tc>
         <w:tc>
           <w:tcPr>
             <w:tcW w:w="465" w:type="pct"/>
-            <w:vAlign w:val="center"/>
-          </w:tcPr>
-          <w:p>
-            <w:pPr>
-              <w:jc w:val="center"/>
-            </w:pPr>
+          </w:tcPr>
+          <w:p>
+            <w:pPr>
+              <w:jc w:val="center"/>
+            </w:pPr>
+            <w:r>
+              <w:rPr>
+                <w:rFonts w:ascii="Calibri" w:hAnsi="Calibri"/>
+                <w:color w:val="000000"/>
+              </w:rPr>
+              <w:t>«M3_B»</w:t>
+            </w:r>
           </w:p>
         </w:tc>
         <w:tc>
           <w:tcPr>
             <w:tcW w:w="536" w:type="pct"/>
             <w:gridSpan w:val="2"/>
-            <w:vAlign w:val="center"/>
-          </w:tcPr>
-          <w:p>
-            <w:pPr>
-              <w:jc w:val="center"/>
-            </w:pPr>
+          </w:tcPr>
+          <w:p>
+            <w:pPr>
+              <w:jc w:val="center"/>
+            </w:pPr>
+            <w:r>
+              <w:rPr>
+                <w:rFonts w:ascii="Calibri" w:hAnsi="Calibri"/>
+                <w:color w:val="000000"/>
+              </w:rPr>
+              <w:t>«M3_S»</w:t>
+            </w:r>
           </w:p>
         </w:tc>
         <w:tc>
           <w:tcPr>
             <w:tcW w:w="572" w:type="pct"/>
             <w:gridSpan w:val="2"/>
-            <w:vAlign w:val="center"/>
-          </w:tcPr>
-          <w:p>
-            <w:pPr>
-              <w:jc w:val="center"/>
-            </w:pPr>
+          </w:tcPr>
+          <w:p>
+            <w:pPr>
+              <w:jc w:val="center"/>
+            </w:pPr>
+            <w:r>
+              <w:rPr>
+                <w:rFonts w:ascii="Calibri" w:hAnsi="Calibri"/>
+                <w:color w:val="000000"/>
+              </w:rPr>
+              <w:t>«M3_I»</w:t>
+            </w:r>
           </w:p>
         </w:tc>
         <w:tc>
           <w:tcPr>
             <w:tcW w:w="376" w:type="pct"/>
-            <w:vAlign w:val="center"/>
-          </w:tcPr>
-          <w:p>
-            <w:pPr>
-              <w:jc w:val="center"/>
-            </w:pPr>
+          </w:tcPr>
+          <w:p>
+            <w:pPr>
+              <w:jc w:val="center"/>
+            </w:pPr>
+            <w:r>
+              <w:rPr>
+                <w:rFonts w:ascii="Calibri" w:hAnsi="Calibri"/>
+                <w:color w:val="000000"/>
+              </w:rPr>
+              <w:t>«M3_NV»</w:t>
+            </w:r>
           </w:p>
         </w:tc>
       </w:tr>
@@ -5255,61 +5701,88 @@
           <w:tcPr>
             <w:tcW w:w="622" w:type="pct"/>
             <w:gridSpan w:val="2"/>
-            <w:vAlign w:val="center"/>
-          </w:tcPr>
-          <w:p>
-            <w:pPr>
-              <w:jc w:val="center"/>
-            </w:pPr>
-            <w:r>
-              <w:t>x</w:t>
+          </w:tcPr>
+          <w:p>
+            <w:pPr>
+              <w:jc w:val="center"/>
+            </w:pPr>
+            <w:r>
+              <w:rPr>
+                <w:rFonts w:ascii="Calibri" w:hAnsi="Calibri"/>
+                <w:color w:val="000000"/>
+              </w:rPr>
+              <w:t>«M4_MB»</w:t>
             </w:r>
           </w:p>
         </w:tc>
         <w:tc>
           <w:tcPr>
             <w:tcW w:w="465" w:type="pct"/>
-            <w:vAlign w:val="center"/>
-          </w:tcPr>
-          <w:p>
-            <w:pPr>
-              <w:jc w:val="center"/>
-            </w:pPr>
+          </w:tcPr>
+          <w:p>
+            <w:pPr>
+              <w:jc w:val="center"/>
+            </w:pPr>
+            <w:r>
+              <w:rPr>
+                <w:rFonts w:ascii="Calibri" w:hAnsi="Calibri"/>
+                <w:color w:val="000000"/>
+              </w:rPr>
+              <w:t>«M4_B»</w:t>
+            </w:r>
           </w:p>
         </w:tc>
         <w:tc>
           <w:tcPr>
             <w:tcW w:w="536" w:type="pct"/>
             <w:gridSpan w:val="2"/>
-            <w:vAlign w:val="center"/>
-          </w:tcPr>
-          <w:p>
-            <w:pPr>
-              <w:jc w:val="center"/>
-            </w:pPr>
+          </w:tcPr>
+          <w:p>
+            <w:pPr>
+              <w:jc w:val="center"/>
+            </w:pPr>
+            <w:r>
+              <w:rPr>
+                <w:rFonts w:ascii="Calibri" w:hAnsi="Calibri"/>
+                <w:color w:val="000000"/>
+              </w:rPr>
+              <w:t>«M4_S»</w:t>
+            </w:r>
           </w:p>
         </w:tc>
         <w:tc>
           <w:tcPr>
             <w:tcW w:w="572" w:type="pct"/>
             <w:gridSpan w:val="2"/>
-            <w:vAlign w:val="center"/>
-          </w:tcPr>
-          <w:p>
-            <w:pPr>
-              <w:jc w:val="center"/>
-            </w:pPr>
+          </w:tcPr>
+          <w:p>
+            <w:pPr>
+              <w:jc w:val="center"/>
+            </w:pPr>
+            <w:r>
+              <w:rPr>
+                <w:rFonts w:ascii="Calibri" w:hAnsi="Calibri"/>
+                <w:color w:val="000000"/>
+              </w:rPr>
+              <w:t>«M4_I»</w:t>
+            </w:r>
           </w:p>
         </w:tc>
         <w:tc>
           <w:tcPr>
             <w:tcW w:w="376" w:type="pct"/>
-            <w:vAlign w:val="center"/>
-          </w:tcPr>
-          <w:p>
-            <w:pPr>
-              <w:jc w:val="center"/>
-            </w:pPr>
+          </w:tcPr>
+          <w:p>
+            <w:pPr>
+              <w:jc w:val="center"/>
+            </w:pPr>
+            <w:r>
+              <w:rPr>
+                <w:rFonts w:ascii="Calibri" w:hAnsi="Calibri"/>
+                <w:color w:val="000000"/>
+              </w:rPr>
+              <w:t>«M4_NV»</w:t>
+            </w:r>
           </w:p>
         </w:tc>
       </w:tr>
@@ -5346,6 +5819,7 @@
           <w:p/>
           <w:p/>
           <w:p/>
+          <w:p/>
         </w:tc>
       </w:tr>
       <w:tr>
@@ -5526,33 +6000,24 @@
               <w:jc w:val="both"/>
             </w:pPr>
             <w:r>
-              <w:t xml:space="preserve">Conoscenze PC (Windows, Internet, ecc.) e della </w:t>
-            </w:r>
-            <w:r>
-              <w:t>e</w:t>
-            </w:r>
-            <w:r>
-              <w:t>-</w:t>
-            </w:r>
-            <w:r>
-              <w:t>m</w:t>
-            </w:r>
-            <w:r>
-              <w:t>ail per comunicare e inviare documenti in allegato (scansionare, salvare, inviare documenti)</w:t>
+              <w:t>Conoscenze PC (Windows, Internet, ecc.) e della e-mail per comunicare e inviare documenti in allegato (scansionare, salvare, inviare documenti)</w:t>
             </w:r>
           </w:p>
         </w:tc>
         <w:tc>
           <w:tcPr>
             <w:tcW w:w="607" w:type="pct"/>
-            <w:vAlign w:val="center"/>
-          </w:tcPr>
-          <w:p>
-            <w:pPr>
-              <w:jc w:val="center"/>
-            </w:pPr>
-            <w:r>
-              <w:t>x</w:t>
+          </w:tcPr>
+          <w:p>
+            <w:pPr>
+              <w:jc w:val="center"/>
+            </w:pPr>
+            <w:r>
+              <w:rPr>
+                <w:rFonts w:ascii="Calibri" w:hAnsi="Calibri"/>
+                <w:color w:val="000000"/>
+              </w:rPr>
+              <w:t>«T0_MB»</w:t>
             </w:r>
           </w:p>
         </w:tc>
@@ -5560,46 +6025,70 @@
           <w:tcPr>
             <w:tcW w:w="483" w:type="pct"/>
             <w:gridSpan w:val="3"/>
-            <w:vAlign w:val="center"/>
-          </w:tcPr>
-          <w:p>
-            <w:pPr>
-              <w:jc w:val="center"/>
-            </w:pPr>
+          </w:tcPr>
+          <w:p>
+            <w:pPr>
+              <w:jc w:val="center"/>
+            </w:pPr>
+            <w:r>
+              <w:rPr>
+                <w:rFonts w:ascii="Calibri" w:hAnsi="Calibri"/>
+                <w:color w:val="000000"/>
+              </w:rPr>
+              <w:t>«T0_B»</w:t>
+            </w:r>
           </w:p>
         </w:tc>
         <w:tc>
           <w:tcPr>
             <w:tcW w:w="533" w:type="pct"/>
-            <w:vAlign w:val="center"/>
-          </w:tcPr>
-          <w:p>
-            <w:pPr>
-              <w:jc w:val="center"/>
-            </w:pPr>
+          </w:tcPr>
+          <w:p>
+            <w:pPr>
+              <w:jc w:val="center"/>
+            </w:pPr>
+            <w:r>
+              <w:rPr>
+                <w:rFonts w:ascii="Calibri" w:hAnsi="Calibri"/>
+                <w:color w:val="000000"/>
+              </w:rPr>
+              <w:t>«T0_S»</w:t>
+            </w:r>
           </w:p>
         </w:tc>
         <w:tc>
           <w:tcPr>
             <w:tcW w:w="572" w:type="pct"/>
             <w:gridSpan w:val="2"/>
-            <w:vAlign w:val="center"/>
-          </w:tcPr>
-          <w:p>
-            <w:pPr>
-              <w:jc w:val="center"/>
-            </w:pPr>
+          </w:tcPr>
+          <w:p>
+            <w:pPr>
+              <w:jc w:val="center"/>
+            </w:pPr>
+            <w:r>
+              <w:rPr>
+                <w:rFonts w:ascii="Calibri" w:hAnsi="Calibri"/>
+                <w:color w:val="000000"/>
+              </w:rPr>
+              <w:t>«T0_I»</w:t>
+            </w:r>
           </w:p>
         </w:tc>
         <w:tc>
           <w:tcPr>
             <w:tcW w:w="376" w:type="pct"/>
-            <w:vAlign w:val="center"/>
-          </w:tcPr>
-          <w:p>
-            <w:pPr>
-              <w:jc w:val="center"/>
-            </w:pPr>
+          </w:tcPr>
+          <w:p>
+            <w:pPr>
+              <w:jc w:val="center"/>
+            </w:pPr>
+            <w:r>
+              <w:rPr>
+                <w:rFonts w:ascii="Calibri" w:hAnsi="Calibri"/>
+                <w:color w:val="000000"/>
+              </w:rPr>
+              <w:t>«T0_NV»</w:t>
+            </w:r>
           </w:p>
         </w:tc>
       </w:tr>
@@ -5618,6 +6107,19 @@
           <w:p>
             <w:r>
               <w:t>Osservazioni:</w:t>
+            </w:r>
+          </w:p>
+          <w:p>
+            <w:pPr>
+              <w:rPr>
+                <w:lang w:val="it-CH"/>
+              </w:rPr>
+            </w:pPr>
+            <w:r>
+              <w:rPr>
+                <w:lang w:val="it-CH"/>
+              </w:rPr>
+              <w:t>«OSS_TIC»</w:t>
             </w:r>
           </w:p>
           <w:p/>
@@ -6008,7 +6510,7 @@
         </w:tc>
         <w:tc>
           <w:tcPr>
-            <w:tcW w:w="292" w:type="pct"/>
+            <w:tcW w:w="291" w:type="pct"/>
             <w:gridSpan w:val="2"/>
             <w:vAlign w:val="center"/>
           </w:tcPr>
@@ -6054,14 +6556,17 @@
           <w:tcPr>
             <w:tcW w:w="552" w:type="pct"/>
             <w:gridSpan w:val="2"/>
-            <w:vAlign w:val="center"/>
-          </w:tcPr>
-          <w:p>
-            <w:pPr>
-              <w:jc w:val="center"/>
-            </w:pPr>
-            <w:r>
-              <w:t>x</w:t>
+          </w:tcPr>
+          <w:p>
+            <w:pPr>
+              <w:jc w:val="center"/>
+            </w:pPr>
+            <w:r>
+              <w:rPr>
+                <w:rFonts w:ascii="Calibri" w:hAnsi="Calibri"/>
+                <w:color w:val="000000"/>
+              </w:rPr>
+              <w:t>«R0_MB»</w:t>
             </w:r>
           </w:p>
         </w:tc>
@@ -6069,48 +6574,72 @@
           <w:tcPr>
             <w:tcW w:w="415" w:type="pct"/>
             <w:gridSpan w:val="2"/>
-            <w:vAlign w:val="center"/>
-          </w:tcPr>
-          <w:p>
-            <w:pPr>
-              <w:jc w:val="center"/>
-            </w:pPr>
+          </w:tcPr>
+          <w:p>
+            <w:pPr>
+              <w:jc w:val="center"/>
+            </w:pPr>
+            <w:r>
+              <w:rPr>
+                <w:rFonts w:ascii="Calibri" w:hAnsi="Calibri"/>
+                <w:color w:val="000000"/>
+              </w:rPr>
+              <w:t>«R0_B»</w:t>
+            </w:r>
           </w:p>
         </w:tc>
         <w:tc>
           <w:tcPr>
             <w:tcW w:w="483" w:type="pct"/>
             <w:gridSpan w:val="3"/>
-            <w:vAlign w:val="center"/>
-          </w:tcPr>
-          <w:p>
-            <w:pPr>
-              <w:jc w:val="center"/>
-            </w:pPr>
+          </w:tcPr>
+          <w:p>
+            <w:pPr>
+              <w:jc w:val="center"/>
+            </w:pPr>
+            <w:r>
+              <w:rPr>
+                <w:rFonts w:ascii="Calibri" w:hAnsi="Calibri"/>
+                <w:color w:val="000000"/>
+              </w:rPr>
+              <w:t>«R0_S»</w:t>
+            </w:r>
           </w:p>
         </w:tc>
         <w:tc>
           <w:tcPr>
             <w:tcW w:w="625" w:type="pct"/>
             <w:gridSpan w:val="3"/>
-            <w:vAlign w:val="center"/>
-          </w:tcPr>
-          <w:p>
-            <w:pPr>
-              <w:jc w:val="center"/>
-            </w:pPr>
-          </w:p>
-        </w:tc>
-        <w:tc>
-          <w:tcPr>
-            <w:tcW w:w="292" w:type="pct"/>
+          </w:tcPr>
+          <w:p>
+            <w:pPr>
+              <w:jc w:val="center"/>
+            </w:pPr>
+            <w:r>
+              <w:rPr>
+                <w:rFonts w:ascii="Calibri" w:hAnsi="Calibri"/>
+                <w:color w:val="000000"/>
+              </w:rPr>
+              <w:t>«R0_I»</w:t>
+            </w:r>
+          </w:p>
+        </w:tc>
+        <w:tc>
+          <w:tcPr>
+            <w:tcW w:w="291" w:type="pct"/>
             <w:gridSpan w:val="2"/>
-            <w:vAlign w:val="center"/>
-          </w:tcPr>
-          <w:p>
-            <w:pPr>
-              <w:jc w:val="center"/>
-            </w:pPr>
+          </w:tcPr>
+          <w:p>
+            <w:pPr>
+              <w:jc w:val="center"/>
+            </w:pPr>
+            <w:r>
+              <w:rPr>
+                <w:rFonts w:ascii="Calibri" w:hAnsi="Calibri"/>
+                <w:color w:val="000000"/>
+              </w:rPr>
+              <w:t>«R0_NV»</w:t>
+            </w:r>
           </w:p>
         </w:tc>
       </w:tr>
@@ -6138,14 +6667,17 @@
           <w:tcPr>
             <w:tcW w:w="552" w:type="pct"/>
             <w:gridSpan w:val="2"/>
-            <w:vAlign w:val="center"/>
-          </w:tcPr>
-          <w:p>
-            <w:pPr>
-              <w:jc w:val="center"/>
-            </w:pPr>
-            <w:r>
-              <w:t>x</w:t>
+          </w:tcPr>
+          <w:p>
+            <w:pPr>
+              <w:jc w:val="center"/>
+            </w:pPr>
+            <w:r>
+              <w:rPr>
+                <w:rFonts w:ascii="Calibri" w:hAnsi="Calibri"/>
+                <w:color w:val="000000"/>
+              </w:rPr>
+              <w:t>«R1_MB»</w:t>
             </w:r>
           </w:p>
         </w:tc>
@@ -6153,48 +6685,72 @@
           <w:tcPr>
             <w:tcW w:w="415" w:type="pct"/>
             <w:gridSpan w:val="2"/>
-            <w:vAlign w:val="center"/>
-          </w:tcPr>
-          <w:p>
-            <w:pPr>
-              <w:jc w:val="center"/>
-            </w:pPr>
+          </w:tcPr>
+          <w:p>
+            <w:pPr>
+              <w:jc w:val="center"/>
+            </w:pPr>
+            <w:r>
+              <w:rPr>
+                <w:rFonts w:ascii="Calibri" w:hAnsi="Calibri"/>
+                <w:color w:val="000000"/>
+              </w:rPr>
+              <w:t>«R1_B»</w:t>
+            </w:r>
           </w:p>
         </w:tc>
         <w:tc>
           <w:tcPr>
             <w:tcW w:w="483" w:type="pct"/>
             <w:gridSpan w:val="3"/>
-            <w:vAlign w:val="center"/>
-          </w:tcPr>
-          <w:p>
-            <w:pPr>
-              <w:jc w:val="center"/>
-            </w:pPr>
+          </w:tcPr>
+          <w:p>
+            <w:pPr>
+              <w:jc w:val="center"/>
+            </w:pPr>
+            <w:r>
+              <w:rPr>
+                <w:rFonts w:ascii="Calibri" w:hAnsi="Calibri"/>
+                <w:color w:val="000000"/>
+              </w:rPr>
+              <w:t>«R1_S»</w:t>
+            </w:r>
           </w:p>
         </w:tc>
         <w:tc>
           <w:tcPr>
             <w:tcW w:w="625" w:type="pct"/>
             <w:gridSpan w:val="3"/>
-            <w:vAlign w:val="center"/>
-          </w:tcPr>
-          <w:p>
-            <w:pPr>
-              <w:jc w:val="center"/>
-            </w:pPr>
-          </w:p>
-        </w:tc>
-        <w:tc>
-          <w:tcPr>
-            <w:tcW w:w="292" w:type="pct"/>
+          </w:tcPr>
+          <w:p>
+            <w:pPr>
+              <w:jc w:val="center"/>
+            </w:pPr>
+            <w:r>
+              <w:rPr>
+                <w:rFonts w:ascii="Calibri" w:hAnsi="Calibri"/>
+                <w:color w:val="000000"/>
+              </w:rPr>
+              <w:t>«R1_I»</w:t>
+            </w:r>
+          </w:p>
+        </w:tc>
+        <w:tc>
+          <w:tcPr>
+            <w:tcW w:w="291" w:type="pct"/>
             <w:gridSpan w:val="2"/>
-            <w:vAlign w:val="center"/>
-          </w:tcPr>
-          <w:p>
-            <w:pPr>
-              <w:jc w:val="center"/>
-            </w:pPr>
+          </w:tcPr>
+          <w:p>
+            <w:pPr>
+              <w:jc w:val="center"/>
+            </w:pPr>
+            <w:r>
+              <w:rPr>
+                <w:rFonts w:ascii="Calibri" w:hAnsi="Calibri"/>
+                <w:color w:val="000000"/>
+              </w:rPr>
+              <w:t>«R1_NV»</w:t>
+            </w:r>
           </w:p>
         </w:tc>
       </w:tr>
@@ -6222,14 +6778,17 @@
           <w:tcPr>
             <w:tcW w:w="552" w:type="pct"/>
             <w:gridSpan w:val="2"/>
-            <w:vAlign w:val="center"/>
-          </w:tcPr>
-          <w:p>
-            <w:pPr>
-              <w:jc w:val="center"/>
-            </w:pPr>
-            <w:r>
-              <w:t>x</w:t>
+          </w:tcPr>
+          <w:p>
+            <w:pPr>
+              <w:jc w:val="center"/>
+            </w:pPr>
+            <w:r>
+              <w:rPr>
+                <w:rFonts w:ascii="Calibri" w:hAnsi="Calibri"/>
+                <w:color w:val="000000"/>
+              </w:rPr>
+              <w:t>«R2_MB»</w:t>
             </w:r>
           </w:p>
         </w:tc>
@@ -6237,48 +6796,72 @@
           <w:tcPr>
             <w:tcW w:w="415" w:type="pct"/>
             <w:gridSpan w:val="2"/>
-            <w:vAlign w:val="center"/>
-          </w:tcPr>
-          <w:p>
-            <w:pPr>
-              <w:jc w:val="center"/>
-            </w:pPr>
+          </w:tcPr>
+          <w:p>
+            <w:pPr>
+              <w:jc w:val="center"/>
+            </w:pPr>
+            <w:r>
+              <w:rPr>
+                <w:rFonts w:ascii="Calibri" w:hAnsi="Calibri"/>
+                <w:color w:val="000000"/>
+              </w:rPr>
+              <w:t>«R2_B»</w:t>
+            </w:r>
           </w:p>
         </w:tc>
         <w:tc>
           <w:tcPr>
             <w:tcW w:w="483" w:type="pct"/>
             <w:gridSpan w:val="3"/>
-            <w:vAlign w:val="center"/>
-          </w:tcPr>
-          <w:p>
-            <w:pPr>
-              <w:jc w:val="center"/>
-            </w:pPr>
+          </w:tcPr>
+          <w:p>
+            <w:pPr>
+              <w:jc w:val="center"/>
+            </w:pPr>
+            <w:r>
+              <w:rPr>
+                <w:rFonts w:ascii="Calibri" w:hAnsi="Calibri"/>
+                <w:color w:val="000000"/>
+              </w:rPr>
+              <w:t>«R2_S»</w:t>
+            </w:r>
           </w:p>
         </w:tc>
         <w:tc>
           <w:tcPr>
             <w:tcW w:w="625" w:type="pct"/>
             <w:gridSpan w:val="3"/>
-            <w:vAlign w:val="center"/>
-          </w:tcPr>
-          <w:p>
-            <w:pPr>
-              <w:jc w:val="center"/>
-            </w:pPr>
-          </w:p>
-        </w:tc>
-        <w:tc>
-          <w:tcPr>
-            <w:tcW w:w="292" w:type="pct"/>
+          </w:tcPr>
+          <w:p>
+            <w:pPr>
+              <w:jc w:val="center"/>
+            </w:pPr>
+            <w:r>
+              <w:rPr>
+                <w:rFonts w:ascii="Calibri" w:hAnsi="Calibri"/>
+                <w:color w:val="000000"/>
+              </w:rPr>
+              <w:t>«R2_I»</w:t>
+            </w:r>
+          </w:p>
+        </w:tc>
+        <w:tc>
+          <w:tcPr>
+            <w:tcW w:w="291" w:type="pct"/>
             <w:gridSpan w:val="2"/>
-            <w:vAlign w:val="center"/>
-          </w:tcPr>
-          <w:p>
-            <w:pPr>
-              <w:jc w:val="center"/>
-            </w:pPr>
+          </w:tcPr>
+          <w:p>
+            <w:pPr>
+              <w:jc w:val="center"/>
+            </w:pPr>
+            <w:r>
+              <w:rPr>
+                <w:rFonts w:ascii="Calibri" w:hAnsi="Calibri"/>
+                <w:color w:val="000000"/>
+              </w:rPr>
+              <w:t>«R2_NV»</w:t>
+            </w:r>
           </w:p>
         </w:tc>
       </w:tr>
@@ -6306,14 +6889,17 @@
           <w:tcPr>
             <w:tcW w:w="552" w:type="pct"/>
             <w:gridSpan w:val="2"/>
-            <w:vAlign w:val="center"/>
-          </w:tcPr>
-          <w:p>
-            <w:pPr>
-              <w:jc w:val="center"/>
-            </w:pPr>
-            <w:r>
-              <w:t>x</w:t>
+          </w:tcPr>
+          <w:p>
+            <w:pPr>
+              <w:jc w:val="center"/>
+            </w:pPr>
+            <w:r>
+              <w:rPr>
+                <w:rFonts w:ascii="Calibri" w:hAnsi="Calibri"/>
+                <w:color w:val="000000"/>
+              </w:rPr>
+              <w:t>«R3_MB»</w:t>
             </w:r>
           </w:p>
         </w:tc>
@@ -6321,48 +6907,72 @@
           <w:tcPr>
             <w:tcW w:w="415" w:type="pct"/>
             <w:gridSpan w:val="2"/>
-            <w:vAlign w:val="center"/>
-          </w:tcPr>
-          <w:p>
-            <w:pPr>
-              <w:jc w:val="center"/>
-            </w:pPr>
+          </w:tcPr>
+          <w:p>
+            <w:pPr>
+              <w:jc w:val="center"/>
+            </w:pPr>
+            <w:r>
+              <w:rPr>
+                <w:rFonts w:ascii="Calibri" w:hAnsi="Calibri"/>
+                <w:color w:val="000000"/>
+              </w:rPr>
+              <w:t>«R3_B»</w:t>
+            </w:r>
           </w:p>
         </w:tc>
         <w:tc>
           <w:tcPr>
             <w:tcW w:w="483" w:type="pct"/>
             <w:gridSpan w:val="3"/>
-            <w:vAlign w:val="center"/>
-          </w:tcPr>
-          <w:p>
-            <w:pPr>
-              <w:jc w:val="center"/>
-            </w:pPr>
+          </w:tcPr>
+          <w:p>
+            <w:pPr>
+              <w:jc w:val="center"/>
+            </w:pPr>
+            <w:r>
+              <w:rPr>
+                <w:rFonts w:ascii="Calibri" w:hAnsi="Calibri"/>
+                <w:color w:val="000000"/>
+              </w:rPr>
+              <w:t>«R3_S»</w:t>
+            </w:r>
           </w:p>
         </w:tc>
         <w:tc>
           <w:tcPr>
             <w:tcW w:w="625" w:type="pct"/>
             <w:gridSpan w:val="3"/>
-            <w:vAlign w:val="center"/>
-          </w:tcPr>
-          <w:p>
-            <w:pPr>
-              <w:jc w:val="center"/>
-            </w:pPr>
-          </w:p>
-        </w:tc>
-        <w:tc>
-          <w:tcPr>
-            <w:tcW w:w="292" w:type="pct"/>
+          </w:tcPr>
+          <w:p>
+            <w:pPr>
+              <w:jc w:val="center"/>
+            </w:pPr>
+            <w:r>
+              <w:rPr>
+                <w:rFonts w:ascii="Calibri" w:hAnsi="Calibri"/>
+                <w:color w:val="000000"/>
+              </w:rPr>
+              <w:t>«R3_I»</w:t>
+            </w:r>
+          </w:p>
+        </w:tc>
+        <w:tc>
+          <w:tcPr>
+            <w:tcW w:w="291" w:type="pct"/>
             <w:gridSpan w:val="2"/>
-            <w:vAlign w:val="center"/>
-          </w:tcPr>
-          <w:p>
-            <w:pPr>
-              <w:jc w:val="center"/>
-            </w:pPr>
+          </w:tcPr>
+          <w:p>
+            <w:pPr>
+              <w:jc w:val="center"/>
+            </w:pPr>
+            <w:r>
+              <w:rPr>
+                <w:rFonts w:ascii="Calibri" w:hAnsi="Calibri"/>
+                <w:color w:val="000000"/>
+              </w:rPr>
+              <w:t>«R3_NV»</w:t>
+            </w:r>
           </w:p>
         </w:tc>
       </w:tr>
@@ -6382,7 +6992,15 @@
           </w:tcPr>
           <w:p>
             <w:r>
-              <w:t>Capacità di usare i canali adeguati per cercare lavoro</w:t>
+              <w:t xml:space="preserve">Capacità di usare i canali adeguati </w:t>
+            </w:r>
+            <w:proofErr w:type="gramStart"/>
+            <w:r>
+              <w:t>per</w:t>
+            </w:r>
+            <w:proofErr w:type="gramEnd"/>
+            <w:r>
+              <w:t xml:space="preserve"> cercare lavoro</w:t>
             </w:r>
           </w:p>
         </w:tc>
@@ -6390,14 +7008,17 @@
           <w:tcPr>
             <w:tcW w:w="552" w:type="pct"/>
             <w:gridSpan w:val="2"/>
-            <w:vAlign w:val="center"/>
-          </w:tcPr>
-          <w:p>
-            <w:pPr>
-              <w:jc w:val="center"/>
-            </w:pPr>
-            <w:r>
-              <w:t>x</w:t>
+          </w:tcPr>
+          <w:p>
+            <w:pPr>
+              <w:jc w:val="center"/>
+            </w:pPr>
+            <w:r>
+              <w:rPr>
+                <w:rFonts w:ascii="Calibri" w:hAnsi="Calibri"/>
+                <w:color w:val="000000"/>
+              </w:rPr>
+              <w:t>«R4_MB»</w:t>
             </w:r>
           </w:p>
         </w:tc>
@@ -6405,48 +7026,72 @@
           <w:tcPr>
             <w:tcW w:w="415" w:type="pct"/>
             <w:gridSpan w:val="2"/>
-            <w:vAlign w:val="center"/>
-          </w:tcPr>
-          <w:p>
-            <w:pPr>
-              <w:jc w:val="center"/>
-            </w:pPr>
+          </w:tcPr>
+          <w:p>
+            <w:pPr>
+              <w:jc w:val="center"/>
+            </w:pPr>
+            <w:r>
+              <w:rPr>
+                <w:rFonts w:ascii="Calibri" w:hAnsi="Calibri"/>
+                <w:color w:val="000000"/>
+              </w:rPr>
+              <w:t>«R4_B»</w:t>
+            </w:r>
           </w:p>
         </w:tc>
         <w:tc>
           <w:tcPr>
             <w:tcW w:w="483" w:type="pct"/>
             <w:gridSpan w:val="3"/>
-            <w:vAlign w:val="center"/>
-          </w:tcPr>
-          <w:p>
-            <w:pPr>
-              <w:jc w:val="center"/>
-            </w:pPr>
+          </w:tcPr>
+          <w:p>
+            <w:pPr>
+              <w:jc w:val="center"/>
+            </w:pPr>
+            <w:r>
+              <w:rPr>
+                <w:rFonts w:ascii="Calibri" w:hAnsi="Calibri"/>
+                <w:color w:val="000000"/>
+              </w:rPr>
+              <w:t>«R4_S»</w:t>
+            </w:r>
           </w:p>
         </w:tc>
         <w:tc>
           <w:tcPr>
             <w:tcW w:w="625" w:type="pct"/>
             <w:gridSpan w:val="3"/>
-            <w:vAlign w:val="center"/>
-          </w:tcPr>
-          <w:p>
-            <w:pPr>
-              <w:jc w:val="center"/>
-            </w:pPr>
-          </w:p>
-        </w:tc>
-        <w:tc>
-          <w:tcPr>
-            <w:tcW w:w="292" w:type="pct"/>
+          </w:tcPr>
+          <w:p>
+            <w:pPr>
+              <w:jc w:val="center"/>
+            </w:pPr>
+            <w:r>
+              <w:rPr>
+                <w:rFonts w:ascii="Calibri" w:hAnsi="Calibri"/>
+                <w:color w:val="000000"/>
+              </w:rPr>
+              <w:t>«R4_I»</w:t>
+            </w:r>
+          </w:p>
+        </w:tc>
+        <w:tc>
+          <w:tcPr>
+            <w:tcW w:w="291" w:type="pct"/>
             <w:gridSpan w:val="2"/>
-            <w:vAlign w:val="center"/>
-          </w:tcPr>
-          <w:p>
-            <w:pPr>
-              <w:jc w:val="center"/>
-            </w:pPr>
+          </w:tcPr>
+          <w:p>
+            <w:pPr>
+              <w:jc w:val="center"/>
+            </w:pPr>
+            <w:r>
+              <w:rPr>
+                <w:rFonts w:ascii="Calibri" w:hAnsi="Calibri"/>
+                <w:color w:val="000000"/>
+              </w:rPr>
+              <w:t>«R4_NV»</w:t>
+            </w:r>
           </w:p>
         </w:tc>
       </w:tr>
@@ -6889,12 +7534,36 @@
           <w:p>
             <w:pPr>
               <w:rPr>
-                <w:b/>
-              </w:rPr>
-            </w:pPr>
-            <w:r>
-              <w:t xml:space="preserve">«OSS_CANALI_RICERCA» </w:t>
-            </w:r>
+                <w:lang w:val="it-CH"/>
+              </w:rPr>
+            </w:pPr>
+            <w:r>
+              <w:rPr>
+                <w:lang w:val="it-CH"/>
+              </w:rPr>
+              <w:t>«OSS_CANALI_RICERCA»</w:t>
+            </w:r>
+          </w:p>
+          <w:p>
+            <w:pPr>
+              <w:rPr>
+                <w:b/>
+              </w:rPr>
+            </w:pPr>
+          </w:p>
+          <w:p>
+            <w:pPr>
+              <w:rPr>
+                <w:b/>
+              </w:rPr>
+            </w:pPr>
+          </w:p>
+          <w:p>
+            <w:pPr>
+              <w:rPr>
+                <w:b/>
+              </w:rPr>
+            </w:pPr>
           </w:p>
         </w:tc>
       </w:tr>
@@ -7007,12 +7676,10 @@
             </w:pPr>
             <w:r>
               <w:rPr>
-                <w:rFonts w:ascii="Segoe UI Symbol" w:hAnsi="Segoe UI Symbol" w:cs="Segoe UI Symbol"/>
-                <w:sz w:val="22"/>
-                <w:szCs w:val="22"/>
-                <w:lang w:val="it-CH" w:eastAsia="it-CH"/>
-              </w:rPr>
-              <w:t>☒</w:t>
+                <w:rFonts w:ascii="Calibri" w:hAnsi="Calibri"/>
+                <w:color w:val="000000"/>
+              </w:rPr>
+              <w:t>«VO_MB»</w:t>
             </w:r>
           </w:p>
         </w:tc>
@@ -7053,12 +7720,10 @@
             </w:pPr>
             <w:r>
               <w:rPr>
-                <w:rStyle w:val="unicode"/>
-                <w:rFonts w:ascii="MS Mincho" w:eastAsia="MS Mincho" w:hAnsi="MS Mincho" w:cs="MS Mincho" w:hint="eastAsia"/>
-                <w:sz w:val="22"/>
-                <w:szCs w:val="27"/>
-              </w:rPr>
-              <w:t>☐</w:t>
+                <w:rFonts w:ascii="Calibri" w:hAnsi="Calibri"/>
+                <w:color w:val="000000"/>
+              </w:rPr>
+              <w:t>«VO_B»</w:t>
             </w:r>
           </w:p>
         </w:tc>
@@ -7100,12 +7765,10 @@
             </w:pPr>
             <w:r>
               <w:rPr>
-                <w:rStyle w:val="unicode"/>
-                <w:rFonts w:ascii="MS Mincho" w:eastAsia="MS Mincho" w:hAnsi="MS Mincho" w:cs="MS Mincho" w:hint="eastAsia"/>
-                <w:sz w:val="22"/>
-                <w:szCs w:val="27"/>
-              </w:rPr>
-              <w:t>☐</w:t>
+                <w:rFonts w:ascii="Calibri" w:hAnsi="Calibri"/>
+                <w:color w:val="000000"/>
+              </w:rPr>
+              <w:t>«VO_S»</w:t>
             </w:r>
           </w:p>
         </w:tc>
@@ -7146,12 +7809,10 @@
             </w:pPr>
             <w:r>
               <w:rPr>
-                <w:rStyle w:val="unicode"/>
-                <w:rFonts w:ascii="MS Mincho" w:eastAsia="MS Mincho" w:hAnsi="MS Mincho" w:cs="MS Mincho" w:hint="eastAsia"/>
-                <w:sz w:val="22"/>
-                <w:szCs w:val="27"/>
-              </w:rPr>
-              <w:t>☐</w:t>
+                <w:rFonts w:ascii="Calibri" w:hAnsi="Calibri"/>
+                <w:color w:val="000000"/>
+              </w:rPr>
+              <w:t>«VO_I»</w:t>
             </w:r>
           </w:p>
         </w:tc>
@@ -7192,12 +7853,10 @@
             </w:pPr>
             <w:r>
               <w:rPr>
-                <w:rStyle w:val="unicode"/>
-                <w:rFonts w:ascii="MS Mincho" w:eastAsia="MS Mincho" w:hAnsi="MS Mincho" w:cs="MS Mincho" w:hint="eastAsia"/>
-                <w:sz w:val="22"/>
-                <w:szCs w:val="27"/>
-              </w:rPr>
-              <w:t>☐</w:t>
+                <w:rFonts w:ascii="Calibri" w:hAnsi="Calibri"/>
+                <w:color w:val="000000"/>
+              </w:rPr>
+              <w:t>«VO_NV»</w:t>
             </w:r>
           </w:p>
         </w:tc>
@@ -7228,11 +7887,21 @@
           </w:p>
           <w:p>
             <w:pPr>
+              <w:rPr>
+                <w:lang w:val="it-CH"/>
+              </w:rPr>
+            </w:pPr>
+            <w:r>
+              <w:rPr>
+                <w:lang w:val="it-CH"/>
+              </w:rPr>
+              <w:t>«OSS_VALUTAZIONE_RICERCA»</w:t>
+            </w:r>
+          </w:p>
+          <w:p>
+            <w:pPr>
               <w:jc w:val="both"/>
             </w:pPr>
-            <w:r>
-              <w:t>«OSS_VALUTAZIONE_RICERCA»</w:t>
-            </w:r>
           </w:p>
           <w:p>
             <w:pPr>
@@ -8187,7 +8856,7 @@
                 <w:noProof/>
                 <w:lang w:val="it-CH"/>
               </w:rPr>
-              <w:t>23. gennaio 2026</w:t>
+              <w:t>23. marzo 2026</w:t>
             </w:r>
             <w:r>
               <w:rPr>
@@ -12495,10 +13164,6 @@
 </file>
 
 <file path=customXml/item1.xml><?xml version="1.0" encoding="utf-8"?>
-<b:Sources xmlns:b="http://schemas.openxmlformats.org/officeDocument/2006/bibliography" xmlns="http://schemas.openxmlformats.org/officeDocument/2006/bibliography" SelectedStyle="\APA.XSL" StyleName="APA"/>
-</file>
-
-<file path=customXml/item2.xml><?xml version="1.0" encoding="utf-8"?>
 <?mso-contentType ?>
 <FormTemplates xmlns="http://schemas.microsoft.com/sharepoint/v3/contenttype/forms">
   <Display>DocumentLibraryForm</Display>
@@ -12507,9 +13172,9 @@
 </FormTemplates>
 </file>
 
-<file path=customXml/item3.xml><?xml version="1.0" encoding="utf-8"?>
-<ct:contentTypeSchema xmlns:ct="http://schemas.microsoft.com/office/2006/metadata/contentType" xmlns:ma="http://schemas.microsoft.com/office/2006/metadata/properties/metaAttributes" ct:_="" ma:_="" ma:contentTypeName="Documento" ma:contentTypeID="0x0101008A598A5E926D2749B864705B94B863B6" ma:contentTypeVersion="7" ma:contentTypeDescription="Creare un nuovo documento." ma:contentTypeScope="" ma:versionID="29002e3623d6c2f17755d1db5c93ac60">
-  <xsd:schema xmlns:xsd="http://www.w3.org/2001/XMLSchema" xmlns:xs="http://www.w3.org/2001/XMLSchema" xmlns:p="http://schemas.microsoft.com/office/2006/metadata/properties" xmlns:ns2="d8aa2813-352d-4524-8617-7ff344a714e4" targetNamespace="http://schemas.microsoft.com/office/2006/metadata/properties" ma:root="true" ma:fieldsID="4963f0e2f4651eb11261b38d578c19a8" ns2:_="">
+<file path=customXml/item2.xml><?xml version="1.0" encoding="utf-8"?>
+<ct:contentTypeSchema xmlns:ct="http://schemas.microsoft.com/office/2006/metadata/contentType" xmlns:ma="http://schemas.microsoft.com/office/2006/metadata/properties/metaAttributes" ct:_="" ma:_="" ma:contentTypeName="Documento" ma:contentTypeID="0x0101008A598A5E926D2749B864705B94B863B6" ma:contentTypeVersion="7" ma:contentTypeDescription="Creare un nuovo documento." ma:contentTypeScope="" ma:versionID="8496c960b2b59483dc438ac12d811e3b">
+  <xsd:schema xmlns:xsd="http://www.w3.org/2001/XMLSchema" xmlns:xs="http://www.w3.org/2001/XMLSchema" xmlns:p="http://schemas.microsoft.com/office/2006/metadata/properties" xmlns:ns2="d8aa2813-352d-4524-8617-7ff344a714e4" targetNamespace="http://schemas.microsoft.com/office/2006/metadata/properties" ma:root="true" ma:fieldsID="c15d54c96a358c63e03a7cb2400d1b89" ns2:_="">
     <xsd:import namespace="d8aa2813-352d-4524-8617-7ff344a714e4"/>
     <xsd:element name="properties">
       <xsd:complexType>
@@ -12669,21 +13334,17 @@
 </ct:contentTypeSchema>
 </file>
 
-<file path=customXml/item4.xml><?xml version="1.0" encoding="utf-8"?>
+<file path=customXml/item3.xml><?xml version="1.0" encoding="utf-8"?>
 <p:properties xmlns:p="http://schemas.microsoft.com/office/2006/metadata/properties" xmlns:xsi="http://www.w3.org/2001/XMLSchema-instance" xmlns:pc="http://schemas.microsoft.com/office/infopath/2007/PartnerControls">
   <documentManagement/>
 </p:properties>
 </file>
 
-<file path=customXml/itemProps1.xml><?xml version="1.0" encoding="utf-8"?>
-<ds:datastoreItem xmlns:ds="http://schemas.openxmlformats.org/officeDocument/2006/customXml" ds:itemID="{16729470-53F0-4019-9D66-147180118A6A}">
-  <ds:schemaRefs>
-    <ds:schemaRef ds:uri="http://schemas.openxmlformats.org/officeDocument/2006/bibliography"/>
-  </ds:schemaRefs>
-</ds:datastoreItem>
+<file path=customXml/item4.xml><?xml version="1.0" encoding="utf-8"?>
+<b:Sources xmlns:b="http://schemas.openxmlformats.org/officeDocument/2006/bibliography" xmlns="http://schemas.openxmlformats.org/officeDocument/2006/bibliography" SelectedStyle="\APA.XSL" StyleName="APA"/>
 </file>
 
-<file path=customXml/itemProps2.xml><?xml version="1.0" encoding="utf-8"?>
+<file path=customXml/itemProps1.xml><?xml version="1.0" encoding="utf-8"?>
 <ds:datastoreItem xmlns:ds="http://schemas.openxmlformats.org/officeDocument/2006/customXml" ds:itemID="{30E82EF1-1BA7-43AF-9E65-7E7FD8A1B093}">
   <ds:schemaRefs>
     <ds:schemaRef ds:uri="http://schemas.microsoft.com/sharepoint/v3/contenttype/forms"/>
@@ -12691,8 +13352,8 @@
 </ds:datastoreItem>
 </file>
 
-<file path=customXml/itemProps3.xml><?xml version="1.0" encoding="utf-8"?>
-<ds:datastoreItem xmlns:ds="http://schemas.openxmlformats.org/officeDocument/2006/customXml" ds:itemID="{A6845E5F-F06D-412D-93FA-28B355E0C96E}">
+<file path=customXml/itemProps2.xml><?xml version="1.0" encoding="utf-8"?>
+<ds:datastoreItem xmlns:ds="http://schemas.openxmlformats.org/officeDocument/2006/customXml" ds:itemID="{461FC85D-6C9A-49D3-A31B-32B91D4F8AE5}">
   <ds:schemaRefs>
     <ds:schemaRef ds:uri="http://schemas.microsoft.com/office/2006/metadata/contentType"/>
     <ds:schemaRef ds:uri="http://schemas.microsoft.com/office/2006/metadata/properties/metaAttributes"/>
@@ -12709,11 +13370,19 @@
 </ds:datastoreItem>
 </file>
 
-<file path=customXml/itemProps4.xml><?xml version="1.0" encoding="utf-8"?>
+<file path=customXml/itemProps3.xml><?xml version="1.0" encoding="utf-8"?>
 <ds:datastoreItem xmlns:ds="http://schemas.openxmlformats.org/officeDocument/2006/customXml" ds:itemID="{33F53ADD-4E62-4459-BD98-B88F4A813AFE}">
   <ds:schemaRefs>
     <ds:schemaRef ds:uri="http://schemas.microsoft.com/office/2006/metadata/properties"/>
     <ds:schemaRef ds:uri="http://schemas.microsoft.com/office/infopath/2007/PartnerControls"/>
   </ds:schemaRefs>
 </ds:datastoreItem>
+</file>
+
+<file path=customXml/itemProps4.xml><?xml version="1.0" encoding="utf-8"?>
+<ds:datastoreItem xmlns:ds="http://schemas.openxmlformats.org/officeDocument/2006/customXml" ds:itemID="{16729470-53F0-4019-9D66-147180118A6A}">
+  <ds:schemaRefs>
+    <ds:schemaRef ds:uri="http://schemas.openxmlformats.org/officeDocument/2006/bibliography"/>
+  </ds:schemaRefs>
+</ds:datastoreItem>
 </file>
</xml_diff>